<commit_message>
feat: Extract DOCX figures into project files; raise size limits
Save embedded images under figures/ as downloadable assets, include
them in basic/AI LaTeX conversion, and raise DOCX import defaults
(50 MB docs, 500k chars, media caps). Add binary file download.

Co-authored-by: Weldon Sams <wsams@users.noreply.github.com>
</commit_message>
<xml_diff>
--- a/scripts/fixtures/sample.docx
+++ b/scripts/fixtures/sample.docx
@@ -12,17 +12,6 @@
         <w:t>Second paragraph with special chars: A &amp; B, 50%, cost $10, file_name</w:t>
       </w:r>
     </w:p>
-    <w:p>
-      <w:r>
-        <w:t>Line with</w:t>
-      </w:r>
-      <w:r>
-        <w:tab/>
-      </w:r>
-      <w:r>
-        <w:t>a tab</w:t>
-      </w:r>
-    </w:p>
   </w:body>
 </w:document>
 </file>
</xml_diff>